<commit_message>
feat(project-04): finalize 100% complete implementation, models, tests, docs, PPT, and video demonstration for PROJECT-004
</commit_message>
<xml_diff>
--- a/project_04_car_price_prediction/docs/technical_documentation.docx
+++ b/project_04_car_price_prediction/docs/technical_documentation.docx
@@ -4,154 +4,51 @@
   <w:body>
     <w:p>
       <w:pPr>
-        <w:spacing w:after="240"/>
+        <w:jc w:val="center"/>
       </w:pPr>
       <w:r>
         <w:rPr>
           <w:b/>
-          <w:color w:val="102C57"/>
-          <w:sz w:val="40"/>
+          <w:color w:val="2563EB"/>
+          <w:sz w:val="22"/>
         </w:rPr>
-        <w:t>PROJECT 04: CAR PRICE PREDICTION</w:t>
+        <w:t>PROJECT 04 OF 55 • FINAL YEAR TECHNICAL REPORT</w:t>
+        <w:br/>
       </w:r>
-    </w:p>
-    <w:p>
-      <w:pPr>
-        <w:spacing w:after="360"/>
-      </w:pPr>
+      <w:r>
+        <w:rPr>
+          <w:b/>
+          <w:color w:val="0F172A"/>
+          <w:sz w:val="44"/>
+        </w:rPr>
+        <w:t>Car Price Prediction &amp; Automotive Valuation Engine</w:t>
+        <w:br/>
+      </w:r>
       <w:r>
         <w:rPr>
           <w:i/>
           <w:color w:val="64748B"/>
-          <w:sz w:val="22"/>
+          <w:sz w:val="26"/>
         </w:rPr>
-        <w:t>Academic &amp; Enterprise Implementation Specification  |  Project 4 of 55</w:t>
+        <w:t>A Multi-Algorithm Machine Learning Regression Pipeline with Depreciation Curve Modeling, 90% Confidence Intervals, and Production REST API</w:t>
+        <w:br/>
       </w:r>
     </w:p>
-    <w:p>
-      <w:pPr>
-        <w:pStyle w:val="Heading1"/>
-        <w:spacing w:before="240" w:after="120"/>
-      </w:pPr>
-      <w:r>
-        <w:t>1. Executive Abstract</w:t>
-      </w:r>
-    </w:p>
-    <w:p>
-      <w:pPr>
-        <w:spacing w:line="276" w:lineRule="auto" w:after="280"/>
-      </w:pPr>
-      <w:r>
-        <w:t>The rapid growth of the automobile market has increased the need for accurate car price evaluation systems. Manual appraisal often lacks consistency and depends heavily on individual expertise, leading to inaccurate pricing. This project proposes a machine learning–based car price prediction system using Random Forest Regression. The model analyzes historical car data and learns the relationship between features such as brand, model, year, mileage, fuel type, engine capacity, transmission type, and other relevant factors. By leveraging the ensemble learning capabilities of Random Forest, the system provides reliable and accurate price predictions, helping buyers, sellers, and dealers make informed decisions. The proposed model reduces pricing errors and offers a scalable and automated solution for modern car price estimation.</w:t>
-      </w:r>
-    </w:p>
-    <w:p>
-      <w:pPr>
-        <w:pStyle w:val="Heading1"/>
-        <w:spacing w:before="280" w:after="120"/>
-      </w:pPr>
-      <w:r>
-        <w:t>2. Phase 1 — Requirements, Data &amp; Baseline Prototype</w:t>
-      </w:r>
-    </w:p>
-    <w:p>
-      <w:pPr>
-        <w:pStyle w:val="Heading2"/>
-      </w:pPr>
-      <w:r>
-        <w:t>2.1 Problem Definition &amp; Operational Scope</w:t>
-      </w:r>
-    </w:p>
-    <w:p>
-      <w:r>
-        <w:t>The system operational scenario specifies autonomous real-time processing of incoming telemetry, video, or data inputs. Input boundaries, anomaly thresholds, and deterministic validation guardrails are enforced prior to inference. Erroneous or out-of-distribution inputs are rejected with low confidence score logs to safeguard downstream decision-making.</w:t>
-      </w:r>
-    </w:p>
-    <w:p>
-      <w:pPr>
-        <w:pStyle w:val="Heading2"/>
-      </w:pPr>
-      <w:r>
-        <w:t>2.2 Data Pipeline &amp; Preprocessing</w:t>
-      </w:r>
-    </w:p>
-    <w:p>
-      <w:r>
-        <w:t>A structured feature dictionary maps raw sensor or domain variables to standardized tensor representations. Missing indicators, standardization (z-score scaling / min-max), outlier winsorization, and class balancing ensure leak-free cross-validation across training, testing, and validation splits.</w:t>
-      </w:r>
-    </w:p>
-    <w:p>
-      <w:pPr>
-        <w:pStyle w:val="Heading2"/>
-      </w:pPr>
-      <w:r>
-        <w:t>2.3 Baseline Model &amp; Reference Experiments</w:t>
-      </w:r>
-    </w:p>
-    <w:p>
-      <w:r>
-        <w:t>An interpretable baseline algorithm establishes benchmark performance criteria prior to deep neural optimization. Hyperparameters, random initialization seeds, loss convergence curves, and baseline latencies are systematically logged.</w:t>
-      </w:r>
-    </w:p>
-    <w:p>
-      <w:pPr>
-        <w:pStyle w:val="Heading1"/>
-        <w:spacing w:before="280" w:after="120"/>
-      </w:pPr>
-      <w:r>
-        <w:t>3. Phase 2 — Deep Learning Optimization &amp; System Integration</w:t>
-      </w:r>
-    </w:p>
-    <w:p>
-      <w:pPr>
-        <w:pStyle w:val="Heading2"/>
-      </w:pPr>
-      <w:r>
-        <w:t>3.1 Neural Architecture &amp; Model Refinement</w:t>
-      </w:r>
-    </w:p>
-    <w:p>
-      <w:r>
-        <w:t>Advanced neural architectures (transfer learning, attention mechanisms, temporal convolutions, or recurrent encoders) are tuned with Bayesian hyperparameter sweeps. Regularization (dropout, weight decay, gradient clipping) prevents overfitting.</w:t>
-      </w:r>
-    </w:p>
-    <w:p>
-      <w:pPr>
-        <w:pStyle w:val="Heading2"/>
-      </w:pPr>
-      <w:r>
-        <w:t>3.2 Full-Stack Integration &amp; Architecture</w:t>
-      </w:r>
-    </w:p>
-    <w:p>
-      <w:r>
-        <w:t>The microservice architecture incorporates a high-performance asynchronous REST API Gateway (FastAPI / Express), an automated database persistence layer (SQLite / PostgreSQL), and a responsive analytical dashboard for monitoring.</w:t>
-      </w:r>
-    </w:p>
-    <w:p>
-      <w:pPr>
-        <w:pStyle w:val="Heading1"/>
-        <w:spacing w:before="280" w:after="120"/>
-      </w:pPr>
-      <w:r>
-        <w:t>4. Technical Specifications &amp; Environment</w:t>
-      </w:r>
-    </w:p>
+    <w:p/>
     <w:tbl>
       <w:tblPr>
-        <w:tblStyle w:val="TableGrid"/>
         <w:tblW w:type="auto" w:w="0"/>
         <w:jc w:val="center"/>
         <w:tblLook w:firstColumn="1" w:firstRow="1" w:lastColumn="0" w:lastRow="0" w:noHBand="0" w:noVBand="1" w:val="04A0"/>
       </w:tblPr>
       <w:tblGrid>
-        <w:gridCol w:w="4320"/>
-        <w:gridCol w:w="4320"/>
+        <w:gridCol w:w="4680"/>
+        <w:gridCol w:w="4680"/>
       </w:tblGrid>
       <w:tr>
         <w:tc>
           <w:tcPr>
-            <w:tcW w:type="dxa" w:w="4320"/>
+            <w:tcW w:type="dxa" w:w="4680"/>
           </w:tcPr>
           <w:p>
             <w:r>
@@ -164,11 +61,11 @@
         </w:tc>
         <w:tc>
           <w:tcPr>
-            <w:tcW w:type="dxa" w:w="4320"/>
+            <w:tcW w:type="dxa" w:w="4680"/>
           </w:tcPr>
           <w:p>
             <w:r>
-              <w:t>Project 04 of 55</w:t>
+              <w:t>PROJECT-004 (Muthayammal Engineering College)</w:t>
             </w:r>
           </w:p>
         </w:tc>
@@ -176,24 +73,24 @@
       <w:tr>
         <w:tc>
           <w:tcPr>
-            <w:tcW w:type="dxa" w:w="4320"/>
+            <w:tcW w:type="dxa" w:w="4680"/>
           </w:tcPr>
           <w:p>
             <w:r>
               <w:rPr>
                 <w:b/>
               </w:rPr>
-              <w:t>Default Service Port</w:t>
+              <w:t>Subject Domain</w:t>
             </w:r>
           </w:p>
         </w:tc>
         <w:tc>
           <w:tcPr>
-            <w:tcW w:type="dxa" w:w="4320"/>
+            <w:tcW w:type="dxa" w:w="4680"/>
           </w:tcPr>
           <w:p>
             <w:r>
-              <w:t>http://localhost:5004</w:t>
+              <w:t>Automotive Intelligence / Machine Learning / Applied Regression</w:t>
             </w:r>
           </w:p>
         </w:tc>
@@ -201,24 +98,24 @@
       <w:tr>
         <w:tc>
           <w:tcPr>
-            <w:tcW w:type="dxa" w:w="4320"/>
+            <w:tcW w:type="dxa" w:w="4680"/>
           </w:tcPr>
           <w:p>
             <w:r>
               <w:rPr>
                 <w:b/>
               </w:rPr>
-              <w:t>Primary Backend Framework</w:t>
+              <w:t>Core Algorithms</w:t>
             </w:r>
           </w:p>
         </w:tc>
         <w:tc>
           <w:tcPr>
-            <w:tcW w:type="dxa" w:w="4320"/>
+            <w:tcW w:type="dxa" w:w="4680"/>
           </w:tcPr>
           <w:p>
             <w:r>
-              <w:t>Python 3.10+ / FastAPI / PyTorch / Scikit-learn</w:t>
+              <w:t>Random Forest Regressor (150 trees), Decision Tree, Linear Regression (OLS)</w:t>
             </w:r>
           </w:p>
         </w:tc>
@@ -226,24 +123,24 @@
       <w:tr>
         <w:tc>
           <w:tcPr>
-            <w:tcW w:type="dxa" w:w="4320"/>
+            <w:tcW w:type="dxa" w:w="4680"/>
           </w:tcPr>
           <w:p>
             <w:r>
               <w:rPr>
                 <w:b/>
               </w:rPr>
-              <w:t>Frontend Interface</w:t>
+              <w:t>Optimal Performance</w:t>
             </w:r>
           </w:p>
         </w:tc>
         <w:tc>
           <w:tcPr>
-            <w:tcW w:type="dxa" w:w="4320"/>
+            <w:tcW w:type="dxa" w:w="4680"/>
           </w:tcPr>
           <w:p>
             <w:r>
-              <w:t>Interactive Web Portal (HTML5, Tailwind/CSS, Modern JS)</w:t>
+              <w:t>Test R² = 0.9723 (97.23%), RMSE = ₹1.3989 Lakhs, MAE = ₹0.8835 Lakhs</w:t>
             </w:r>
           </w:p>
         </w:tc>
@@ -251,24 +148,24 @@
       <w:tr>
         <w:tc>
           <w:tcPr>
-            <w:tcW w:type="dxa" w:w="4320"/>
+            <w:tcW w:type="dxa" w:w="4680"/>
           </w:tcPr>
           <w:p>
             <w:r>
               <w:rPr>
                 <w:b/>
               </w:rPr>
-              <w:t>Evaluation Metrics</w:t>
+              <w:t>Software Stack</w:t>
             </w:r>
           </w:p>
         </w:tc>
         <w:tc>
           <w:tcPr>
-            <w:tcW w:type="dxa" w:w="4320"/>
+            <w:tcW w:type="dxa" w:w="4680"/>
           </w:tcPr>
           <w:p>
             <w:r>
-              <w:t>Accuracy (&gt;=93%), F1-Score (&gt;=0.91), Latency (&lt;35ms)</w:t>
+              <w:t>Python 3.12, Scikit-Learn 1.3+, FastAPI REST Service (Port 5004), SQLite3, HTML5 UI</w:t>
             </w:r>
           </w:p>
         </w:tc>
@@ -276,56 +173,957 @@
       <w:tr>
         <w:tc>
           <w:tcPr>
-            <w:tcW w:type="dxa" w:w="4320"/>
+            <w:tcW w:type="dxa" w:w="4680"/>
           </w:tcPr>
           <w:p>
             <w:r>
               <w:rPr>
                 <w:b/>
               </w:rPr>
-              <w:t>Deployment Options</w:t>
+              <w:t>Verification Status</w:t>
             </w:r>
           </w:p>
         </w:tc>
         <w:tc>
           <w:tcPr>
-            <w:tcW w:type="dxa" w:w="4320"/>
+            <w:tcW w:type="dxa" w:w="4680"/>
           </w:tcPr>
           <w:p>
             <w:r>
-              <w:t>Local Python Virtualenv, Docker Container, Edge IoT Device</w:t>
+              <w:t>VERIFIED COMPLETE (18/18 Tests Passed, 100% Pass Rate)</w:t>
             </w:r>
           </w:p>
         </w:tc>
       </w:tr>
     </w:tbl>
+    <w:p/>
     <w:p>
       <w:pPr>
-        <w:pStyle w:val="Heading1"/>
-        <w:spacing w:before="280" w:after="120"/>
+        <w:spacing w:before="280" w:after="80"/>
       </w:pPr>
       <w:r>
-        <w:t>5. Setup &amp; Operational Verification</w:t>
+        <w:rPr>
+          <w:b/>
+          <w:color w:val="2563EB"/>
+          <w:sz w:val="30"/>
+        </w:rPr>
+        <w:t>Abstract</w:t>
       </w:r>
     </w:p>
     <w:p>
+      <w:pPr>
+        <w:spacing w:after="120" w:line="276" w:lineRule="auto"/>
+      </w:pPr>
       <w:r>
-        <w:t>1. Navigate to the project root directory.</w:t>
-        <w:br/>
-        <w:t>2. Install required dependencies: pip install -r requirements.txt</w:t>
-        <w:br/>
-        <w:t>3. Launch the application from source_code/:</w:t>
-        <w:br/>
-        <w:t xml:space="preserve">   - Python backend: python source_code/backend/main.py (or run_system.py / app.py)</w:t>
-        <w:br/>
-        <w:t xml:space="preserve">   - Frontend UI: Open source_code/frontend/index.html in any modern browser</w:t>
-        <w:br/>
-        <w:t>4. Verify endpoint health by querying GET /health</w:t>
+        <w:rPr>
+          <w:color w:val="334155"/>
+          <w:sz w:val="21"/>
+        </w:rPr>
+        <w:t>The global pre-owned automotive market experiences severe valuation inefficiencies characterized by high information asymmetry, speculative dealership margins, and intricate non-linear price depreciation dynamics. Traditional appraisal methods rely on manual trade-in guides that fail to capture the multi-dimensional interactions between vehicle age, odometer mileage, powertrain technology, ownership provenance, and brand residual equity. This final-year engineering capstone delivers AutoValuate AI, an automated, production-grade automotive market valuation system powered by machine learning regression pipelines.</w:t>
+      </w:r>
+    </w:p>
+    <w:p>
+      <w:pPr>
+        <w:spacing w:after="120" w:line="276" w:lineRule="auto"/>
+      </w:pPr>
+      <w:r>
+        <w:rPr>
+          <w:color w:val="334155"/>
+          <w:sz w:val="21"/>
+        </w:rPr>
+        <w:t>The system incorporates an end-to-end data processing and model evaluation pipeline comparing three distinct regression architectures: an Ordinary Least Squares (OLS) Linear Regressor baseline, a single CART Decision Tree Regressor, and a 150-estimator Random Forest Regressor. Evaluated on 450 verified vehicle transactions under a strict 80:20 train-test split, the Random Forest model achieves superior predictive accuracy with a test R² of 0.9723 (97.23% variance explained), a Root Mean Squared Error (RMSE) of ₹1.3989 Lakhs, and a Mean Absolute Error (MAE) of ₹0.8835 Lakhs (~$1,060 USD). Beyond scalar price predictions, the system computes 90% confidence intervals, assigns discrete value retention tiers, models a dynamic 10-year value decay trajectory, and exposes a production FastAPI microservice operating on Port 5004 coupled with an ACID-compliant SQLite audit database. The system is verified by 18 passing automated pytest cases and complete video demonstration evidence.</w:t>
+      </w:r>
+    </w:p>
+    <w:p>
+      <w:pPr>
+        <w:spacing w:before="280" w:after="80"/>
+      </w:pPr>
+      <w:r>
+        <w:rPr>
+          <w:b/>
+          <w:color w:val="2563EB"/>
+          <w:sz w:val="30"/>
+        </w:rPr>
+        <w:t>1. Introduction &amp; Market Problem Statement</w:t>
+      </w:r>
+    </w:p>
+    <w:p>
+      <w:pPr>
+        <w:spacing w:after="120" w:line="276" w:lineRule="auto"/>
+      </w:pPr>
+      <w:r>
+        <w:rPr>
+          <w:color w:val="334155"/>
+          <w:sz w:val="21"/>
+        </w:rPr>
+        <w:t>The secondary automobile marketplace represents a multi-billion dollar economic engine worldwide. In India alone, used car transactions exceed new car sales by a factor of 1.4x, driven by rapid urbanization, rising disposable income, and expanding digital automotive marketplaces such as Cars24, Spinny, and CarDekho. Despite rapid market expansion, pricing in the pre-owned segment remains largely unstandardized.</w:t>
+      </w:r>
+    </w:p>
+    <w:p>
+      <w:pPr>
+        <w:spacing w:after="120" w:line="276" w:lineRule="auto"/>
+      </w:pPr>
+      <w:r>
+        <w:rPr>
+          <w:color w:val="334155"/>
+          <w:sz w:val="21"/>
+        </w:rPr>
+        <w:t>Key market bottlenecks include: (1) Severe Information Asymmetry: Uninformed consumers face arbitrary price gouging or undervalued trade-ins; (2) Dealership Spread Inefficiencies: Intermediaries capture 15% to 30% margin spreads due to lack of objective valuation standards; (3) Non-linear Depreciation: Vehicle value decays exponentially during the initial 36 months, after which mechanical reliability and brand perception dictate the long-term price curve; and (4) Financing &amp; Insurance Bottlenecks: Non-bank financial corporations (NBFCs) and insurers require rapid, automated valuation APIs to collateralize used vehicle loans and compute accurate insured declared values (IDV).</w:t>
+      </w:r>
+    </w:p>
+    <w:p>
+      <w:pPr>
+        <w:spacing w:after="120" w:line="276" w:lineRule="auto"/>
+      </w:pPr>
+      <w:r>
+        <w:rPr>
+          <w:color w:val="334155"/>
+          <w:sz w:val="21"/>
+        </w:rPr>
+        <w:t>To address these challenges, this project engineers a robust Scikit-Learn regression pipeline capable of predicting fair market value within sub-8 millisecond latencies, supported by statistical confidence boundaries and explainable feature importance weighting.</w:t>
+      </w:r>
+    </w:p>
+    <w:p>
+      <w:pPr>
+        <w:spacing w:before="280" w:after="80"/>
+      </w:pPr>
+      <w:r>
+        <w:rPr>
+          <w:b/>
+          <w:color w:val="2563EB"/>
+          <w:sz w:val="30"/>
+        </w:rPr>
+        <w:t>2. Automotive Economics &amp; Price Depreciation Dynamics</w:t>
+      </w:r>
+    </w:p>
+    <w:p>
+      <w:pPr>
+        <w:spacing w:after="120" w:line="276" w:lineRule="auto"/>
+      </w:pPr>
+      <w:r>
+        <w:rPr>
+          <w:color w:val="334155"/>
+          <w:sz w:val="21"/>
+        </w:rPr>
+        <w:t>Automotive depreciation is mathematically defined as the monetary loss in vehicle value over time due to wear, obsolescence, mileage accumulation, and market sentiment. While simple accounting uses straight-line depreciation, real-world vehicle value follows an exponential decay trajectory:</w:t>
+      </w:r>
+    </w:p>
+    <w:p>
+      <w:pPr>
+        <w:spacing w:after="120" w:line="276" w:lineRule="auto"/>
+      </w:pPr>
+      <w:r>
+        <w:rPr>
+          <w:color w:val="334155"/>
+          <w:sz w:val="21"/>
+        </w:rPr>
+        <w:t>V(t) = V_0 * (1 - r)^t</w:t>
+      </w:r>
+    </w:p>
+    <w:p>
+      <w:pPr>
+        <w:spacing w:after="120" w:line="276" w:lineRule="auto"/>
+      </w:pPr>
+      <w:r>
+        <w:rPr>
+          <w:color w:val="334155"/>
+          <w:sz w:val="21"/>
+        </w:rPr>
+        <w:t>where V_0 is the original showroom price, r is the annual depreciation rate (typically 12% to 20% in early lifecycle years), and t is the elapsed vehicle age in years.</w:t>
+      </w:r>
+    </w:p>
+    <w:p>
+      <w:pPr>
+        <w:spacing w:after="120" w:line="276" w:lineRule="auto"/>
+      </w:pPr>
+      <w:r>
+        <w:rPr>
+          <w:color w:val="334155"/>
+          <w:sz w:val="21"/>
+        </w:rPr>
+        <w:t>However, parametric exponential models fail because depreciation rates fluctuate across powertrain classes and market brands. For example, diesel commercial vehicles experience high initial depreciation due to stringent environmental regulations (e.g., 10-year NCR ban), whereas reliable Japanese petrol hatchbacks (Maruti Suzuki Swift, Honda City) demonstrate exceptional value retention. Our machine learning approach captures these complex non-linear interactions without requiring rigid parametric assumptions.</w:t>
+      </w:r>
+    </w:p>
+    <w:p>
+      <w:pPr>
+        <w:spacing w:before="280" w:after="80"/>
+      </w:pPr>
+      <w:r>
+        <w:rPr>
+          <w:b/>
+          <w:color w:val="2563EB"/>
+          <w:sz w:val="30"/>
+        </w:rPr>
+        <w:t>3. Used Car Sales Dataset &amp; Exploratory Data Analysis</w:t>
+      </w:r>
+    </w:p>
+    <w:p>
+      <w:pPr>
+        <w:spacing w:after="120" w:line="276" w:lineRule="auto"/>
+      </w:pPr>
+      <w:r>
+        <w:rPr>
+          <w:color w:val="334155"/>
+          <w:sz w:val="21"/>
+        </w:rPr>
+        <w:t>The system is trained and benchmarked on a curated dataset of 450 verified pre-owned car sales spanning diverse segments—from entry-level commuter hatchbacks to executive sedans and luxury full-size SUVs. The dataset incorporates nine raw dimensions:</w:t>
+      </w:r>
+    </w:p>
+    <w:p>
+      <w:pPr>
+        <w:spacing w:after="120" w:line="276" w:lineRule="auto"/>
+      </w:pPr>
+      <w:r>
+        <w:rPr>
+          <w:color w:val="334155"/>
+          <w:sz w:val="21"/>
+        </w:rPr>
+        <w:t>• Car_Name: Free-text vehicle name and model variant (e.g., 'ritz', 'sx4', 'city', 'innova', 'fortuner').</w:t>
+      </w:r>
+    </w:p>
+    <w:p>
+      <w:pPr>
+        <w:spacing w:after="120" w:line="276" w:lineRule="auto"/>
+      </w:pPr>
+      <w:r>
+        <w:rPr>
+          <w:color w:val="334155"/>
+          <w:sz w:val="21"/>
+        </w:rPr>
+        <w:t>• Year: Year of manufacturing (ranging from 2003 to 2018).</w:t>
+      </w:r>
+    </w:p>
+    <w:p>
+      <w:pPr>
+        <w:spacing w:after="120" w:line="276" w:lineRule="auto"/>
+      </w:pPr>
+      <w:r>
+        <w:rPr>
+          <w:color w:val="334155"/>
+          <w:sz w:val="21"/>
+        </w:rPr>
+        <w:t>• Selling_Price (Target): Historical transaction price in Lakhs (₹100,000 INR).</w:t>
+      </w:r>
+    </w:p>
+    <w:p>
+      <w:pPr>
+        <w:spacing w:after="120" w:line="276" w:lineRule="auto"/>
+      </w:pPr>
+      <w:r>
+        <w:rPr>
+          <w:color w:val="334155"/>
+          <w:sz w:val="21"/>
+        </w:rPr>
+        <w:t>• Present_Price: Original ex-showroom showroom price when new, in Lakhs.</w:t>
+      </w:r>
+    </w:p>
+    <w:p>
+      <w:pPr>
+        <w:spacing w:after="120" w:line="276" w:lineRule="auto"/>
+      </w:pPr>
+      <w:r>
+        <w:rPr>
+          <w:color w:val="334155"/>
+          <w:sz w:val="21"/>
+        </w:rPr>
+        <w:t>• Kms_Driven: Cumulative odometer distance recorded in kilometers (500 km to 500,000 km).</w:t>
+      </w:r>
+    </w:p>
+    <w:p>
+      <w:pPr>
+        <w:spacing w:after="120" w:line="276" w:lineRule="auto"/>
+      </w:pPr>
+      <w:r>
+        <w:rPr>
+          <w:color w:val="334155"/>
+          <w:sz w:val="21"/>
+        </w:rPr>
+        <w:t>• Fuel_Type: Powertrain fuel category (Petrol: 78.3%, Diesel: 20.3%, CNG: 1.4%).</w:t>
+      </w:r>
+    </w:p>
+    <w:p>
+      <w:pPr>
+        <w:spacing w:after="120" w:line="276" w:lineRule="auto"/>
+      </w:pPr>
+      <w:r>
+        <w:rPr>
+          <w:color w:val="334155"/>
+          <w:sz w:val="21"/>
+        </w:rPr>
+        <w:t>• Seller_Type: Sales channel (Dealer: 64.8%, Individual: 35.2%).</w:t>
+      </w:r>
+    </w:p>
+    <w:p>
+      <w:pPr>
+        <w:spacing w:after="120" w:line="276" w:lineRule="auto"/>
+      </w:pPr>
+      <w:r>
+        <w:rPr>
+          <w:color w:val="334155"/>
+          <w:sz w:val="21"/>
+        </w:rPr>
+        <w:t>• Transmission: Gearbox configuration (Manual: 86.4%, Automatic: 13.6%).</w:t>
+      </w:r>
+    </w:p>
+    <w:p>
+      <w:pPr>
+        <w:spacing w:after="120" w:line="276" w:lineRule="auto"/>
+      </w:pPr>
+      <w:r>
+        <w:rPr>
+          <w:color w:val="334155"/>
+          <w:sz w:val="21"/>
+        </w:rPr>
+        <w:t>• Owner: Count of previous legal title transfers (0, 1, 2, 3+).</w:t>
+      </w:r>
+    </w:p>
+    <w:p>
+      <w:pPr>
+        <w:spacing w:after="120" w:line="276" w:lineRule="auto"/>
+      </w:pPr>
+      <w:r>
+        <w:rPr>
+          <w:color w:val="334155"/>
+          <w:sz w:val="21"/>
+        </w:rPr>
+        <w:t>Statistical analysis reveals that Selling_Price correlates most strongly with Present_Price (Pearson r = 0.88) and negatively with Car_Age (Pearson r = -0.42) and Kms_Driven (Pearson r = -0.38).</w:t>
+      </w:r>
+    </w:p>
+    <w:p>
+      <w:pPr>
+        <w:spacing w:before="280" w:after="80"/>
+      </w:pPr>
+      <w:r>
+        <w:rPr>
+          <w:b/>
+          <w:color w:val="2563EB"/>
+          <w:sz w:val="30"/>
+        </w:rPr>
+        <w:t>4. Feature Engineering &amp; Preprocessing Pipeline</w:t>
+      </w:r>
+    </w:p>
+    <w:p>
+      <w:pPr>
+        <w:spacing w:after="120" w:line="276" w:lineRule="auto"/>
+      </w:pPr>
+      <w:r>
+        <w:rPr>
+          <w:color w:val="334155"/>
+          <w:sz w:val="21"/>
+        </w:rPr>
+        <w:t>To ensure generalizability and eliminate numerical instability during model training, raw inputs undergo automated transformation through a Scikit-Learn ColumnTransformer pipeline:</w:t>
+      </w:r>
+    </w:p>
+    <w:p>
+      <w:pPr>
+        <w:spacing w:after="120" w:line="276" w:lineRule="auto"/>
+      </w:pPr>
+      <w:r>
+        <w:rPr>
+          <w:color w:val="334155"/>
+          <w:sz w:val="21"/>
+        </w:rPr>
+        <w:t>1. Vehicle Age Derivation: Car_Age = 2024 - Year. This normalizes chronological timestamps into a direct elapsed wear factor.</w:t>
+      </w:r>
+    </w:p>
+    <w:p>
+      <w:pPr>
+        <w:spacing w:after="120" w:line="276" w:lineRule="auto"/>
+      </w:pPr>
+      <w:r>
+        <w:rPr>
+          <w:color w:val="334155"/>
+          <w:sz w:val="21"/>
+        </w:rPr>
+        <w:t>2. Brand Equity Extraction: Tokenizes Car_Name to isolate the primary manufacturer brand (e.g., 'Maruti', 'Hyundai', 'Honda', 'Toyota', 'BMW'). This captures crucial residual brand value differences.</w:t>
+      </w:r>
+    </w:p>
+    <w:p>
+      <w:pPr>
+        <w:spacing w:after="120" w:line="276" w:lineRule="auto"/>
+      </w:pPr>
+      <w:r>
+        <w:rPr>
+          <w:color w:val="334155"/>
+          <w:sz w:val="21"/>
+        </w:rPr>
+        <w:t>3. Continuous Feature Standardization: Applies StandardScaler to [Car_Age, Present_Price, Kms_Driven, Owner] to enforce zero mean and unit variance, preventing high-magnitude odometer values from distorting distance metrics.</w:t>
+      </w:r>
+    </w:p>
+    <w:p>
+      <w:pPr>
+        <w:spacing w:after="120" w:line="276" w:lineRule="auto"/>
+      </w:pPr>
+      <w:r>
+        <w:rPr>
+          <w:color w:val="334155"/>
+          <w:sz w:val="21"/>
+        </w:rPr>
+        <w:t>4. Categorical Feature One-Hot Encoding: Applies OneHotEncoder with handle_unknown='ignore' to [Fuel_Type, Seller_Type, Transmission, Brand]. This maps the 8 raw inputs into a 22-dimensional numerical feature space.</w:t>
+      </w:r>
+    </w:p>
+    <w:p>
+      <w:pPr>
+        <w:spacing w:after="120" w:line="276" w:lineRule="auto"/>
+      </w:pPr>
+      <w:r>
+        <w:rPr>
+          <w:color w:val="334155"/>
+          <w:sz w:val="21"/>
+        </w:rPr>
+        <w:t>5. Data Leakage Prevention: Preprocessors are fit strictly on the 80% training partition (360 samples) and applied identically to the 20% test partition (90 samples).</w:t>
+      </w:r>
+    </w:p>
+    <w:p>
+      <w:pPr>
+        <w:spacing w:before="280" w:after="80"/>
+      </w:pPr>
+      <w:r>
+        <w:rPr>
+          <w:b/>
+          <w:color w:val="2563EB"/>
+          <w:sz w:val="30"/>
+        </w:rPr>
+        <w:t>5. Machine Learning Regression Algorithms</w:t>
+      </w:r>
+    </w:p>
+    <w:p>
+      <w:pPr>
+        <w:spacing w:after="120" w:line="276" w:lineRule="auto"/>
+      </w:pPr>
+      <w:r>
+        <w:rPr>
+          <w:color w:val="334155"/>
+          <w:sz w:val="21"/>
+        </w:rPr>
+        <w:t>Three distinct regression algorithms were implemented, tuned, and evaluated:</w:t>
+      </w:r>
+    </w:p>
+    <w:p>
+      <w:pPr>
+        <w:spacing w:after="120" w:line="276" w:lineRule="auto"/>
+      </w:pPr>
+      <w:r>
+        <w:rPr>
+          <w:color w:val="334155"/>
+          <w:sz w:val="21"/>
+        </w:rPr>
+        <w:t>1. Random Forest Regressor: An ensemble of 150 de-correlated decision trees constructed via bootstrap aggregating (bagging). At each node split, a random subset of features is evaluated to minimize correlation between individual trees. Predictions represent the ensemble mean: y_pred = (1/B) * sum(T_b(x)). Constraining maximum depth to 12 prevents individual tree overfitting while maintaining non-linear expressiveness.</w:t>
+      </w:r>
+    </w:p>
+    <w:p>
+      <w:pPr>
+        <w:spacing w:after="120" w:line="276" w:lineRule="auto"/>
+      </w:pPr>
+      <w:r>
+        <w:rPr>
+          <w:color w:val="334155"/>
+          <w:sz w:val="21"/>
+        </w:rPr>
+        <w:t>2. Decision Tree Regressor: A non-parametric supervised learner utilizing the CART (Classification and Regression Trees) algorithm. Minimizes Mean Squared Error (MSE) at each binary partition. Hyperparameters: max_depth=7, min_samples_split=4.</w:t>
+      </w:r>
+    </w:p>
+    <w:p>
+      <w:pPr>
+        <w:spacing w:after="120" w:line="276" w:lineRule="auto"/>
+      </w:pPr>
+      <w:r>
+        <w:rPr>
+          <w:color w:val="334155"/>
+          <w:sz w:val="21"/>
+        </w:rPr>
+        <w:t>3. Ordinary Least Squares (OLS) Linear Regression: A standard linear baseline modeling y = X * beta + epsilon, solved via the closed-form normal equation beta = (X^T X)^-1 X^T y. Provides the linear lower bound.</w:t>
+      </w:r>
+    </w:p>
+    <w:p>
+      <w:pPr>
+        <w:spacing w:before="280" w:after="80"/>
+      </w:pPr>
+      <w:r>
+        <w:rPr>
+          <w:b/>
+          <w:color w:val="2563EB"/>
+          <w:sz w:val="30"/>
+        </w:rPr>
+        <w:t>6. Experimental Results &amp; Comparative Benchmark Evaluation</w:t>
+      </w:r>
+    </w:p>
+    <w:p>
+      <w:pPr>
+        <w:spacing w:after="120" w:line="276" w:lineRule="auto"/>
+      </w:pPr>
+      <w:r>
+        <w:rPr>
+          <w:color w:val="334155"/>
+          <w:sz w:val="21"/>
+        </w:rPr>
+        <w:t>Model performance was evaluated on the identical 90-sample held-out test split using standard regression metrics: Coefficient of Determination (R²), Root Mean Squared Error (RMSE), and Mean Absolute Error (MAE):</w:t>
+      </w:r>
+    </w:p>
+    <w:p>
+      <w:pPr>
+        <w:spacing w:after="120" w:line="276" w:lineRule="auto"/>
+      </w:pPr>
+      <w:r>
+        <w:rPr>
+          <w:color w:val="334155"/>
+          <w:sz w:val="21"/>
+        </w:rPr>
+        <w:t>• Random Forest Regressor: Train R² = 0.9922, Test R² = 0.9723, Test RMSE = ₹1.3989L, Test MAE = ₹0.8835L, Generalization Gap = 0.0199.</w:t>
+      </w:r>
+    </w:p>
+    <w:p>
+      <w:pPr>
+        <w:spacing w:after="120" w:line="276" w:lineRule="auto"/>
+      </w:pPr>
+      <w:r>
+        <w:rPr>
+          <w:color w:val="334155"/>
+          <w:sz w:val="21"/>
+        </w:rPr>
+        <w:t>• Decision Tree Regressor: Train R² = 0.9910, Test R² = 0.9525, Test RMSE = ₹1.8307L, Test MAE = ₹1.1746L, Generalization Gap = 0.0385.</w:t>
+      </w:r>
+    </w:p>
+    <w:p>
+      <w:pPr>
+        <w:spacing w:after="120" w:line="276" w:lineRule="auto"/>
+      </w:pPr>
+      <w:r>
+        <w:rPr>
+          <w:color w:val="334155"/>
+          <w:sz w:val="21"/>
+        </w:rPr>
+        <w:t>• Linear Regression (OLS): Train R² = 0.8856, Test R² = 0.8968, Test RMSE = ₹2.6989L, Test MAE = ₹1.7214L, Generalization Gap = -0.0112.</w:t>
+      </w:r>
+    </w:p>
+    <w:p>
+      <w:pPr>
+        <w:spacing w:after="120" w:line="276" w:lineRule="auto"/>
+      </w:pPr>
+      <w:r>
+        <w:rPr>
+          <w:color w:val="334155"/>
+          <w:sz w:val="21"/>
+        </w:rPr>
+        <w:t>The Random Forest ensemble outperforms Linear Regression by reducing RMSE by 48.2% and MAE by 48.7%, confirming that vehicle depreciation contains substantial non-linear curvatures that linear models cannot adequately represent.</w:t>
+      </w:r>
+    </w:p>
+    <w:p>
+      <w:pPr>
+        <w:spacing w:before="280" w:after="80"/>
+      </w:pPr>
+      <w:r>
+        <w:rPr>
+          <w:b/>
+          <w:color w:val="2563EB"/>
+          <w:sz w:val="30"/>
+        </w:rPr>
+        <w:t>7. Feature Importance Hierarchy &amp; Mathematical Interpretability</w:t>
+      </w:r>
+    </w:p>
+    <w:p>
+      <w:pPr>
+        <w:spacing w:after="120" w:line="276" w:lineRule="auto"/>
+      </w:pPr>
+      <w:r>
+        <w:rPr>
+          <w:color w:val="334155"/>
+          <w:sz w:val="21"/>
+        </w:rPr>
+        <w:t>Feature importances were computed using Mean Decrease in Impurity (MDI / Gini Importance) across the 150 fitted estimators in the Random Forest model:</w:t>
+      </w:r>
+    </w:p>
+    <w:p>
+      <w:pPr>
+        <w:spacing w:after="120" w:line="276" w:lineRule="auto"/>
+      </w:pPr>
+      <w:r>
+        <w:rPr>
+          <w:color w:val="334155"/>
+          <w:sz w:val="21"/>
+        </w:rPr>
+        <w:t>1. Original Showroom Price (Present_Price): 75.14% relative importance. Showroom cost sets the base anchor magnitude for the vehicle asset.</w:t>
+      </w:r>
+    </w:p>
+    <w:p>
+      <w:pPr>
+        <w:spacing w:after="120" w:line="276" w:lineRule="auto"/>
+      </w:pPr>
+      <w:r>
+        <w:rPr>
+          <w:color w:val="334155"/>
+          <w:sz w:val="21"/>
+        </w:rPr>
+        <w:t>2. Vehicle Age (Car_Age): 13.30% relative importance. Primary temporal degradation variable.</w:t>
+      </w:r>
+    </w:p>
+    <w:p>
+      <w:pPr>
+        <w:spacing w:after="120" w:line="276" w:lineRule="auto"/>
+      </w:pPr>
+      <w:r>
+        <w:rPr>
+          <w:color w:val="334155"/>
+          <w:sz w:val="21"/>
+        </w:rPr>
+        <w:t>3. Kilometers Driven (Kms_Driven): 9.31% relative importance. Direct proxy for mechanical and structural wear.</w:t>
+      </w:r>
+    </w:p>
+    <w:p>
+      <w:pPr>
+        <w:spacing w:after="120" w:line="276" w:lineRule="auto"/>
+      </w:pPr>
+      <w:r>
+        <w:rPr>
+          <w:color w:val="334155"/>
+          <w:sz w:val="21"/>
+        </w:rPr>
+        <w:t>4. Manufacturer Brand: 1.32% relative importance. Quantifies brand resale equity (e.g., Toyota vs. European luxury).</w:t>
+      </w:r>
+    </w:p>
+    <w:p>
+      <w:pPr>
+        <w:spacing w:after="120" w:line="276" w:lineRule="auto"/>
+      </w:pPr>
+      <w:r>
+        <w:rPr>
+          <w:color w:val="334155"/>
+          <w:sz w:val="21"/>
+        </w:rPr>
+        <w:t>5. Ownership Count (Owner): 0.33% relative importance.</w:t>
+      </w:r>
+    </w:p>
+    <w:p>
+      <w:pPr>
+        <w:spacing w:after="120" w:line="276" w:lineRule="auto"/>
+      </w:pPr>
+      <w:r>
+        <w:rPr>
+          <w:color w:val="334155"/>
+          <w:sz w:val="21"/>
+        </w:rPr>
+        <w:t>6. Seller Channel (Seller_Type): 0.20% relative importance.</w:t>
+      </w:r>
+    </w:p>
+    <w:p>
+      <w:pPr>
+        <w:spacing w:after="120" w:line="276" w:lineRule="auto"/>
+      </w:pPr>
+      <w:r>
+        <w:rPr>
+          <w:color w:val="334155"/>
+          <w:sz w:val="21"/>
+        </w:rPr>
+        <w:t>7. Transmission Type: 0.20% relative importance.</w:t>
+      </w:r>
+    </w:p>
+    <w:p>
+      <w:pPr>
+        <w:spacing w:after="120" w:line="276" w:lineRule="auto"/>
+      </w:pPr>
+      <w:r>
+        <w:rPr>
+          <w:color w:val="334155"/>
+          <w:sz w:val="21"/>
+        </w:rPr>
+        <w:t>8. Fuel Powertrain: 0.20% relative importance.</w:t>
+      </w:r>
+    </w:p>
+    <w:p>
+      <w:pPr>
+        <w:spacing w:before="280" w:after="80"/>
+      </w:pPr>
+      <w:r>
+        <w:rPr>
+          <w:b/>
+          <w:color w:val="2563EB"/>
+          <w:sz w:val="30"/>
+        </w:rPr>
+        <w:t>8. Production Software Architecture &amp; FastAPI Microservice</w:t>
+      </w:r>
+    </w:p>
+    <w:p>
+      <w:pPr>
+        <w:spacing w:after="120" w:line="276" w:lineRule="auto"/>
+      </w:pPr>
+      <w:r>
+        <w:rPr>
+          <w:color w:val="334155"/>
+          <w:sz w:val="21"/>
+        </w:rPr>
+        <w:t>The production software is architected as an asynchronous microservice using FastAPI, running on Port 5004:</w:t>
+      </w:r>
+    </w:p>
+    <w:p>
+      <w:pPr>
+        <w:spacing w:after="120" w:line="276" w:lineRule="auto"/>
+      </w:pPr>
+      <w:r>
+        <w:rPr>
+          <w:color w:val="334155"/>
+          <w:sz w:val="21"/>
+        </w:rPr>
+        <w:t>• GET /api/health: System operational heartbeat and loaded model catalog.</w:t>
+      </w:r>
+    </w:p>
+    <w:p>
+      <w:pPr>
+        <w:spacing w:after="120" w:line="276" w:lineRule="auto"/>
+      </w:pPr>
+      <w:r>
+        <w:rPr>
+          <w:color w:val="334155"/>
+          <w:sz w:val="21"/>
+        </w:rPr>
+        <w:t>• GET /api/presets: Curated preset vehicles for instant demonstration (Maruti Swift, Honda City, Hyundai Creta, Toyota Fortuner, BMW 3 Series).</w:t>
+      </w:r>
+    </w:p>
+    <w:p>
+      <w:pPr>
+        <w:spacing w:after="120" w:line="276" w:lineRule="auto"/>
+      </w:pPr>
+      <w:r>
+        <w:rPr>
+          <w:color w:val="334155"/>
+          <w:sz w:val="21"/>
+        </w:rPr>
+        <w:t>• POST /api/predict: Executes regression pipeline, computes 90% confidence bounds (using z=1.645 * scaled RMSE), assigns value retention tiers, and logs transaction to SQLite.</w:t>
+      </w:r>
+    </w:p>
+    <w:p>
+      <w:pPr>
+        <w:spacing w:after="120" w:line="276" w:lineRule="auto"/>
+      </w:pPr>
+      <w:r>
+        <w:rPr>
+          <w:color w:val="334155"/>
+          <w:sz w:val="21"/>
+        </w:rPr>
+        <w:t>• GET /api/info: Serialized model hyperparameters, evaluation metrics, and feature importances.</w:t>
+      </w:r>
+    </w:p>
+    <w:p>
+      <w:pPr>
+        <w:spacing w:after="120" w:line="276" w:lineRule="auto"/>
+      </w:pPr>
+      <w:r>
+        <w:rPr>
+          <w:color w:val="334155"/>
+          <w:sz w:val="21"/>
+        </w:rPr>
+        <w:t>• GET /api/history &amp; DELETE /api/history: Full transactional CRUD operations on predictions.db.</w:t>
+      </w:r>
+    </w:p>
+    <w:p>
+      <w:pPr>
+        <w:spacing w:after="120" w:line="276" w:lineRule="auto"/>
+      </w:pPr>
+      <w:r>
+        <w:rPr>
+          <w:color w:val="334155"/>
+          <w:sz w:val="21"/>
+        </w:rPr>
+        <w:t>• GET /api/analytics: Aggregate market metrics including average predicted price, depreciation rates, and brand counts.</w:t>
+      </w:r>
+    </w:p>
+    <w:p>
+      <w:pPr>
+        <w:spacing w:after="120" w:line="276" w:lineRule="auto"/>
+      </w:pPr>
+      <w:r>
+        <w:rPr>
+          <w:color w:val="334155"/>
+          <w:sz w:val="21"/>
+        </w:rPr>
+        <w:t>• GET /api/dataset/sample: Paginated view of historical sales records.</w:t>
+      </w:r>
+    </w:p>
+    <w:p>
+      <w:pPr>
+        <w:spacing w:before="280" w:after="80"/>
+      </w:pPr>
+      <w:r>
+        <w:rPr>
+          <w:b/>
+          <w:color w:val="2563EB"/>
+          <w:sz w:val="30"/>
+        </w:rPr>
+        <w:t>9. Interactive Web Dashboard &amp; Decision Support Interface</w:t>
+      </w:r>
+    </w:p>
+    <w:p>
+      <w:pPr>
+        <w:spacing w:after="120" w:line="276" w:lineRule="auto"/>
+      </w:pPr>
+      <w:r>
+        <w:rPr>
+          <w:color w:val="334155"/>
+          <w:sz w:val="21"/>
+        </w:rPr>
+        <w:t>The user interface is built as a responsive single-page web portal with six dedicated operational views: (1) Valuation Engine with one-click presets and dynamic 10-year depreciation trajectory bars; (2) Model Benchmarks comparison cards; (3) Feature Importance percentage progress visualizers; (4) SQLite Transactional History viewer with record deletion; (5) Dataset Explorer sampling 450 vehicle records; and (6) OpenAPI Interactive REST Documentation.</w:t>
+      </w:r>
+    </w:p>
+    <w:p>
+      <w:pPr>
+        <w:spacing w:before="280" w:after="80"/>
+      </w:pPr>
+      <w:r>
+        <w:rPr>
+          <w:b/>
+          <w:color w:val="2563EB"/>
+          <w:sz w:val="30"/>
+        </w:rPr>
+        <w:t>10. Automated Software QA Testing &amp; Verification</w:t>
+      </w:r>
+    </w:p>
+    <w:p>
+      <w:pPr>
+        <w:spacing w:after="120" w:line="276" w:lineRule="auto"/>
+      </w:pPr>
+      <w:r>
+        <w:rPr>
+          <w:color w:val="334155"/>
+          <w:sz w:val="21"/>
+        </w:rPr>
+        <w:t>Quality assurance is verified by an automated pytest test suite (test_api_and_model.py) comprising 18 comprehensive tests:</w:t>
+      </w:r>
+    </w:p>
+    <w:p>
+      <w:pPr>
+        <w:spacing w:after="120" w:line="276" w:lineRule="auto"/>
+      </w:pPr>
+      <w:r>
+        <w:rPr>
+          <w:color w:val="334155"/>
+          <w:sz w:val="21"/>
+        </w:rPr>
+        <w:t>• Test 1-3: Model artifact loading, Random Forest estimator fitting verification (150 trees), and metric reproducibility on test data.</w:t>
+      </w:r>
+    </w:p>
+    <w:p>
+      <w:pPr>
+        <w:spacing w:after="120" w:line="276" w:lineRule="auto"/>
+      </w:pPr>
+      <w:r>
+        <w:rPr>
+          <w:color w:val="334155"/>
+          <w:sz w:val="21"/>
+        </w:rPr>
+        <w:t>• Test 4-6: FastAPI health check, metadata schema verification, and multi-algorithm inference validation.</w:t>
+      </w:r>
+    </w:p>
+    <w:p>
+      <w:pPr>
+        <w:spacing w:after="120" w:line="276" w:lineRule="auto"/>
+      </w:pPr>
+      <w:r>
+        <w:rPr>
+          <w:color w:val="334155"/>
+          <w:sz w:val="21"/>
+        </w:rPr>
+        <w:t>• Test 7: Pydantic negative boundary validation (12 error cases: negative prices, odometer &gt; 500,000 km, invalid fuels).</w:t>
+      </w:r>
+    </w:p>
+    <w:p>
+      <w:pPr>
+        <w:spacing w:after="120" w:line="276" w:lineRule="auto"/>
+      </w:pPr>
+      <w:r>
+        <w:rPr>
+          <w:color w:val="334155"/>
+          <w:sz w:val="21"/>
+        </w:rPr>
+        <w:t>• Test 8: SQLite database CRUD persistence and record deletion.</w:t>
+      </w:r>
+    </w:p>
+    <w:p>
+      <w:pPr>
+        <w:spacing w:after="120" w:line="276" w:lineRule="auto"/>
+      </w:pPr>
+      <w:r>
+        <w:rPr>
+          <w:color w:val="334155"/>
+          <w:sz w:val="21"/>
+        </w:rPr>
+        <w:t>• Test 9-11: Dataset sampling, presets endpoint, and analytics aggregation.</w:t>
+      </w:r>
+    </w:p>
+    <w:p>
+      <w:pPr>
+        <w:spacing w:after="120" w:line="276" w:lineRule="auto"/>
+      </w:pPr>
+      <w:r>
+        <w:rPr>
+          <w:color w:val="334155"/>
+          <w:sz w:val="21"/>
+        </w:rPr>
+        <w:t>• Test 12-14: HTML portal delivery, preset vehicle valuations, and feature importance consistency.</w:t>
+      </w:r>
+    </w:p>
+    <w:p>
+      <w:pPr>
+        <w:spacing w:after="120" w:line="276" w:lineRule="auto"/>
+      </w:pPr>
+      <w:r>
+        <w:rPr>
+          <w:color w:val="334155"/>
+          <w:sz w:val="21"/>
+        </w:rPr>
+        <w:t>• Test 15-18: Decision tree depth verification (depth &lt;= 8, 22 one-hot features), linear regression coefficients, extreme depreciation on high age/mileage, and history table reset.</w:t>
+      </w:r>
+    </w:p>
+    <w:p>
+      <w:pPr>
+        <w:spacing w:after="120" w:line="276" w:lineRule="auto"/>
+      </w:pPr>
+      <w:r>
+        <w:rPr>
+          <w:color w:val="334155"/>
+          <w:sz w:val="21"/>
+        </w:rPr>
+        <w:t>All 18 tests execute in 2.51 seconds with a 100% pass rate.</w:t>
+      </w:r>
+    </w:p>
+    <w:p>
+      <w:pPr>
+        <w:spacing w:before="280" w:after="80"/>
+      </w:pPr>
+      <w:r>
+        <w:rPr>
+          <w:b/>
+          <w:color w:val="2563EB"/>
+          <w:sz w:val="30"/>
+        </w:rPr>
+        <w:t>11. Conclusion &amp; Future Roadmap</w:t>
+      </w:r>
+    </w:p>
+    <w:p>
+      <w:pPr>
+        <w:spacing w:after="120" w:line="276" w:lineRule="auto"/>
+      </w:pPr>
+      <w:r>
+        <w:rPr>
+          <w:color w:val="334155"/>
+          <w:sz w:val="21"/>
+        </w:rPr>
+        <w:t>This capstone engineering project successfully implements, evaluates, and deploys a production-grade machine learning system for pre-owned automotive valuation. Achieving 97.23% R² accuracy, sub-8ms latency, and full audit logging, AutoValuate AI provides an objective, transparent benchmark for used vehicle pricing.</w:t>
+      </w:r>
+    </w:p>
+    <w:p>
+      <w:pPr>
+        <w:spacing w:after="120" w:line="276" w:lineRule="auto"/>
+      </w:pPr>
+      <w:r>
+        <w:rPr>
+          <w:color w:val="334155"/>
+          <w:sz w:val="21"/>
+        </w:rPr>
+        <w:t>Future engineering enhancements include: (1) Computer Vision integration using YOLOv8 to detect exterior scratches, body panel dents, and paint damage from smartphone photos to compute direct cosmetic penalty deductions; (2) Live OBD-II IoT telemetry integration for real-time engine health scoring; and (3) Regional RTO registration demand indexing across Indian metropolitan states.</w:t>
       </w:r>
     </w:p>
     <w:sectPr>
       <w:pgSz w:w="12240" w:h="15840"/>
-      <w:pgMar w:top="1440" w:right="1800" w:bottom="1440" w:left="1800" w:header="720" w:footer="720" w:gutter="0"/>
+      <w:pgMar w:top="1440" w:right="1440" w:bottom="1440" w:left="1440" w:header="720" w:footer="720" w:gutter="0"/>
       <w:cols w:space="720"/>
       <w:docGrid w:linePitch="360"/>
     </w:sectPr>

</xml_diff>